<commit_message>
Remove TrendForge from downloadable resumes
Co-authored-by: DrewMAX <M0xDr3w@users.noreply.github.com>
</commit_message>
<xml_diff>
--- a/public/Andrew-Macdonald-Resume.docx
+++ b/public/Andrew-Macdonald-Resume.docx
@@ -215,7 +215,7 @@
           <w:sz w:val="21"/>
           <w:szCs w:val="21"/>
         </w:rPr>
-        <w:t xml:space="preserve">Relationship-builder who ships. Path runs real estate → oil &amp; gas crews → coding and AI. TrendForge is live in production; Operator Goods (operator apparel + Notes/Lexicon on the agent loop) is the current build. I learn fast in messy environments, keep judgment at the gate, and ship in public from Grand Valley, Ontario.</w:t>
+        <w:t xml:space="preserve">Relationship-builder who ships. Path runs real estate → oil &amp; gas crews → coding and AI. Operator Goods (operator apparel + Notes/Lexicon on the agent loop) is the current build. I learn fast in messy environments, keep judgment at the gate, and ship in public from Grand Valley, Ontario.</w:t>
       </w:r>
     </w:p>
     <w:p>
@@ -367,142 +367,6 @@
           <w:szCs w:val="21"/>
         </w:rPr>
         <w:t xml:space="preserve">Shipped a Lexicon so shared operator terms stay defined once; Shopify Storefront API linking in progress.</w:t>
-      </w:r>
-    </w:p>
-    <w:p>
-      <w:pPr>
-        <w:tabs>
-          <w:tab w:val="right" w:pos="10800"/>
-        </w:tabs>
-        <w:spacing w:after="0" w:before="90" w:line="230"/>
-      </w:pPr>
-      <w:r>
-        <w:rPr>
-          <w:rFonts w:ascii="Calibri" w:cs="Calibri" w:eastAsia="Calibri" w:hAnsi="Calibri"/>
-          <w:b/>
-          <w:bCs/>
-          <w:color w:val="1B3A4B"/>
-          <w:sz w:val="22"/>
-          <w:szCs w:val="22"/>
-        </w:rPr>
-        <w:t xml:space="preserve">Product engineer — TrendForge</w:t>
-      </w:r>
-      <w:r>
-        <w:rPr>
-          <w:rFonts w:ascii="Calibri" w:cs="Calibri" w:eastAsia="Calibri" w:hAnsi="Calibri"/>
-          <w:i/>
-          <w:iCs/>
-          <w:color w:val="5C6570"/>
-          <w:sz w:val="20"/>
-          <w:szCs w:val="20"/>
-        </w:rPr>
-        <w:t xml:space="preserve">	2025 – Present</w:t>
-      </w:r>
-    </w:p>
-    <w:p>
-      <w:pPr>
-        <w:spacing w:after="20" w:line="220"/>
-      </w:pPr>
-      <w:r>
-        <w:rPr>
-          <w:rFonts w:ascii="Calibri" w:cs="Calibri" w:eastAsia="Calibri" w:hAnsi="Calibri"/>
-          <w:i/>
-          <w:iCs/>
-          <w:color w:val="5C6570"/>
-          <w:sz w:val="20"/>
-          <w:szCs w:val="20"/>
-        </w:rPr>
-        <w:t xml:space="preserve">Independent  ·  </w:t>
-      </w:r>
-      <w:hyperlink w:history="1" r:id="rIdctus54ko6npgksjq6mlof">
-        <w:r>
-          <w:rPr>
-            <w:rFonts w:ascii="Calibri" w:cs="Calibri" w:eastAsia="Calibri" w:hAnsi="Calibri"/>
-            <w:color w:val="1B3A4B"/>
-            <w:sz w:val="20"/>
-            <w:szCs w:val="20"/>
-            <w:u w:val="single"/>
-          </w:rPr>
-          <w:t xml:space="preserve">trendforge-opal.vercel.app</w:t>
-        </w:r>
-      </w:hyperlink>
-      <w:r>
-        <w:rPr>
-          <w:rFonts w:ascii="Calibri" w:cs="Calibri" w:eastAsia="Calibri" w:hAnsi="Calibri"/>
-          <w:color w:val="5C6570"/>
-          <w:sz w:val="20"/>
-          <w:szCs w:val="20"/>
-        </w:rPr>
-        <w:t xml:space="preserve">  ·  </w:t>
-      </w:r>
-      <w:hyperlink w:history="1" r:id="rIdfn-oidyzwx_ebxpneklm7">
-        <w:r>
-          <w:rPr>
-            <w:rFonts w:ascii="Calibri" w:cs="Calibri" w:eastAsia="Calibri" w:hAnsi="Calibri"/>
-            <w:color w:val="1B3A4B"/>
-            <w:sz w:val="20"/>
-            <w:szCs w:val="20"/>
-            <w:u w:val="single"/>
-          </w:rPr>
-          <w:t xml:space="preserve">github.com/M0xDr3w/trendforge</w:t>
-        </w:r>
-      </w:hyperlink>
-    </w:p>
-    <w:p>
-      <w:pPr>
-        <w:pStyle w:val="ListParagraph"/>
-        <w:numPr>
-          <w:ilvl w:val="0"/>
-          <w:numId w:val="2"/>
-        </w:numPr>
-        <w:spacing w:after="24" w:line="230"/>
-      </w:pPr>
-      <w:r>
-        <w:rPr>
-          <w:rFonts w:ascii="Calibri" w:cs="Calibri" w:eastAsia="Calibri" w:hAnsi="Calibri"/>
-          <w:color w:val="222222"/>
-          <w:sz w:val="21"/>
-          <w:szCs w:val="21"/>
-        </w:rPr>
-        <w:t xml:space="preserve">Shipped a production web app: live X ingest under a spend cap, one-radar MVP, LLM content forge, human-gated copy export (no auto-post).</w:t>
-      </w:r>
-    </w:p>
-    <w:p>
-      <w:pPr>
-        <w:pStyle w:val="ListParagraph"/>
-        <w:numPr>
-          <w:ilvl w:val="0"/>
-          <w:numId w:val="2"/>
-        </w:numPr>
-        <w:spacing w:after="24" w:line="230"/>
-      </w:pPr>
-      <w:r>
-        <w:rPr>
-          <w:rFonts w:ascii="Calibri" w:cs="Calibri" w:eastAsia="Calibri" w:hAnsi="Calibri"/>
-          <w:color w:val="222222"/>
-          <w:sz w:val="21"/>
-          <w:szCs w:val="21"/>
-        </w:rPr>
-        <w:t xml:space="preserve">Built the full loop — Vite/React UI, serverless X + Grok proxies, review gate before anything leaves the building.</w:t>
-      </w:r>
-    </w:p>
-    <w:p>
-      <w:pPr>
-        <w:pStyle w:val="ListParagraph"/>
-        <w:numPr>
-          <w:ilvl w:val="0"/>
-          <w:numId w:val="2"/>
-        </w:numPr>
-        <w:spacing w:after="24" w:line="230"/>
-      </w:pPr>
-      <w:r>
-        <w:rPr>
-          <w:rFonts w:ascii="Calibri" w:cs="Calibri" w:eastAsia="Calibri" w:hAnsi="Calibri"/>
-          <w:color w:val="222222"/>
-          <w:sz w:val="21"/>
-          <w:szCs w:val="21"/>
-        </w:rPr>
-        <w:t xml:space="preserve">Also shipped MakerLog, Regex Forge, GrokSim, and Grok DOOM as supporting / experimental tools.</w:t>
       </w:r>
     </w:p>
     <w:p>

</xml_diff>

<commit_message>
Restore side projects line in resumes under own heading
Co-authored-by: DrewMAX <M0xDr3w@users.noreply.github.com>
</commit_message>
<xml_diff>
--- a/public/Andrew-Macdonald-Resume.docx
+++ b/public/Andrew-Macdonald-Resume.docx
@@ -387,6 +387,46 @@
           <w:sz w:val="21"/>
           <w:szCs w:val="21"/>
         </w:rPr>
+        <w:t xml:space="preserve">Side projects</w:t>
+      </w:r>
+    </w:p>
+    <w:p>
+      <w:pPr>
+        <w:pStyle w:val="ListParagraph"/>
+        <w:numPr>
+          <w:ilvl w:val="0"/>
+          <w:numId w:val="2"/>
+        </w:numPr>
+        <w:spacing w:after="24" w:line="230"/>
+      </w:pPr>
+      <w:r>
+        <w:rPr>
+          <w:rFonts w:ascii="Calibri" w:cs="Calibri" w:eastAsia="Calibri" w:hAnsi="Calibri"/>
+          <w:color w:val="222222"/>
+          <w:sz w:val="21"/>
+          <w:szCs w:val="21"/>
+        </w:rPr>
+        <w:t xml:space="preserve">Shipped MakerLog, Regex Forge, GrokSim, and Grok DOOM as supporting / experimental tools.</w:t>
+      </w:r>
+    </w:p>
+    <w:p>
+      <w:pPr>
+        <w:pBdr>
+          <w:bottom w:val="single" w:color="1B3A4B" w:sz="10" w:space="1"/>
+        </w:pBdr>
+        <w:spacing w:after="60" w:before="150"/>
+      </w:pPr>
+      <w:r>
+        <w:rPr>
+          <w:rFonts w:ascii="Calibri" w:cs="Calibri" w:eastAsia="Calibri" w:hAnsi="Calibri"/>
+          <w:b/>
+          <w:bCs/>
+          <w:caps/>
+          <w:color w:val="1B3A4B"/>
+          <w:spacing w:val="60"/>
+          <w:sz w:val="21"/>
+          <w:szCs w:val="21"/>
+        </w:rPr>
         <w:t xml:space="preserve">Experience</w:t>
       </w:r>
     </w:p>

</xml_diff>

<commit_message>
Remove retired TrendForge project + personal-site copy reframe (#6)
* Remove retired TrendForge project from site

Co-authored-by: DrewMAX <M0xDr3w@users.noreply.github.com>

* Reframe site copy around Drew as the builder

Co-authored-by: DrewMAX <M0xDr3w@users.noreply.github.com>

* Remove TrendForge from downloadable resumes

Co-authored-by: DrewMAX <M0xDr3w@users.noreply.github.com>

* Restore side projects line in resumes under own heading

Co-authored-by: DrewMAX <M0xDr3w@users.noreply.github.com>

---------

Co-authored-by: Cursor Agent <cursoragent@cursor.com>
Co-authored-by: DrewMAX <M0xDr3w@users.noreply.github.com>
</commit_message>
<xml_diff>
--- a/public/Andrew-Macdonald-Resume.docx
+++ b/public/Andrew-Macdonald-Resume.docx
@@ -215,7 +215,7 @@
           <w:sz w:val="21"/>
           <w:szCs w:val="21"/>
         </w:rPr>
-        <w:t xml:space="preserve">Relationship-builder who ships. Path runs real estate → oil &amp; gas crews → coding and AI. TrendForge is live in production; Operator Goods (operator apparel + Notes/Lexicon on the agent loop) is the current build. I learn fast in messy environments, keep judgment at the gate, and ship in public from Grand Valley, Ontario.</w:t>
+        <w:t xml:space="preserve">Relationship-builder who ships. Path runs real estate → oil &amp; gas crews → coding and AI. Operator Goods (operator apparel + Notes/Lexicon on the agent loop) is the current build. I learn fast in messy environments, keep judgment at the gate, and ship in public from Grand Valley, Ontario.</w:t>
       </w:r>
     </w:p>
     <w:p>
@@ -371,138 +371,42 @@
     </w:p>
     <w:p>
       <w:pPr>
-        <w:tabs>
-          <w:tab w:val="right" w:pos="10800"/>
-        </w:tabs>
-        <w:spacing w:after="0" w:before="90" w:line="230"/>
+        <w:pBdr>
+          <w:bottom w:val="single" w:color="1B3A4B" w:sz="10" w:space="1"/>
+        </w:pBdr>
+        <w:spacing w:after="60" w:before="150"/>
       </w:pPr>
       <w:r>
         <w:rPr>
           <w:rFonts w:ascii="Calibri" w:cs="Calibri" w:eastAsia="Calibri" w:hAnsi="Calibri"/>
           <w:b/>
           <w:bCs/>
+          <w:caps/>
           <w:color w:val="1B3A4B"/>
-          <w:sz w:val="22"/>
-          <w:szCs w:val="22"/>
-        </w:rPr>
-        <w:t xml:space="preserve">Product engineer — TrendForge</w:t>
-      </w:r>
-      <w:r>
-        <w:rPr>
-          <w:rFonts w:ascii="Calibri" w:cs="Calibri" w:eastAsia="Calibri" w:hAnsi="Calibri"/>
-          <w:i/>
-          <w:iCs/>
-          <w:color w:val="5C6570"/>
-          <w:sz w:val="20"/>
-          <w:szCs w:val="20"/>
-        </w:rPr>
-        <w:t xml:space="preserve">	2025 – Present</w:t>
-      </w:r>
-    </w:p>
-    <w:p>
-      <w:pPr>
-        <w:spacing w:after="20" w:line="220"/>
-      </w:pPr>
-      <w:r>
-        <w:rPr>
-          <w:rFonts w:ascii="Calibri" w:cs="Calibri" w:eastAsia="Calibri" w:hAnsi="Calibri"/>
-          <w:i/>
-          <w:iCs/>
-          <w:color w:val="5C6570"/>
-          <w:sz w:val="20"/>
-          <w:szCs w:val="20"/>
-        </w:rPr>
-        <w:t xml:space="preserve">Independent  ·  </w:t>
-      </w:r>
-      <w:hyperlink w:history="1" r:id="rIdctus54ko6npgksjq6mlof">
-        <w:r>
-          <w:rPr>
-            <w:rFonts w:ascii="Calibri" w:cs="Calibri" w:eastAsia="Calibri" w:hAnsi="Calibri"/>
-            <w:color w:val="1B3A4B"/>
-            <w:sz w:val="20"/>
-            <w:szCs w:val="20"/>
-            <w:u w:val="single"/>
-          </w:rPr>
-          <w:t xml:space="preserve">trendforge-opal.vercel.app</w:t>
-        </w:r>
-      </w:hyperlink>
-      <w:r>
-        <w:rPr>
-          <w:rFonts w:ascii="Calibri" w:cs="Calibri" w:eastAsia="Calibri" w:hAnsi="Calibri"/>
-          <w:color w:val="5C6570"/>
-          <w:sz w:val="20"/>
-          <w:szCs w:val="20"/>
-        </w:rPr>
-        <w:t xml:space="preserve">  ·  </w:t>
-      </w:r>
-      <w:hyperlink w:history="1" r:id="rIdfn-oidyzwx_ebxpneklm7">
-        <w:r>
-          <w:rPr>
-            <w:rFonts w:ascii="Calibri" w:cs="Calibri" w:eastAsia="Calibri" w:hAnsi="Calibri"/>
-            <w:color w:val="1B3A4B"/>
-            <w:sz w:val="20"/>
-            <w:szCs w:val="20"/>
-            <w:u w:val="single"/>
-          </w:rPr>
-          <w:t xml:space="preserve">github.com/M0xDr3w/trendforge</w:t>
-        </w:r>
-      </w:hyperlink>
-    </w:p>
-    <w:p>
-      <w:pPr>
-        <w:pStyle w:val="ListParagraph"/>
-        <w:numPr>
-          <w:ilvl w:val="0"/>
-          <w:numId w:val="2"/>
-        </w:numPr>
-        <w:spacing w:after="24" w:line="230"/>
-      </w:pPr>
-      <w:r>
-        <w:rPr>
-          <w:rFonts w:ascii="Calibri" w:cs="Calibri" w:eastAsia="Calibri" w:hAnsi="Calibri"/>
-          <w:color w:val="222222"/>
-          <w:sz w:val="21"/>
-          <w:szCs w:val="21"/>
-        </w:rPr>
-        <w:t xml:space="preserve">Shipped a production web app: live X ingest under a spend cap, one-radar MVP, LLM content forge, human-gated copy export (no auto-post).</w:t>
-      </w:r>
-    </w:p>
-    <w:p>
-      <w:pPr>
-        <w:pStyle w:val="ListParagraph"/>
-        <w:numPr>
-          <w:ilvl w:val="0"/>
-          <w:numId w:val="2"/>
-        </w:numPr>
-        <w:spacing w:after="24" w:line="230"/>
-      </w:pPr>
-      <w:r>
-        <w:rPr>
-          <w:rFonts w:ascii="Calibri" w:cs="Calibri" w:eastAsia="Calibri" w:hAnsi="Calibri"/>
-          <w:color w:val="222222"/>
-          <w:sz w:val="21"/>
-          <w:szCs w:val="21"/>
-        </w:rPr>
-        <w:t xml:space="preserve">Built the full loop — Vite/React UI, serverless X + Grok proxies, review gate before anything leaves the building.</w:t>
-      </w:r>
-    </w:p>
-    <w:p>
-      <w:pPr>
-        <w:pStyle w:val="ListParagraph"/>
-        <w:numPr>
-          <w:ilvl w:val="0"/>
-          <w:numId w:val="2"/>
-        </w:numPr>
-        <w:spacing w:after="24" w:line="230"/>
-      </w:pPr>
-      <w:r>
-        <w:rPr>
-          <w:rFonts w:ascii="Calibri" w:cs="Calibri" w:eastAsia="Calibri" w:hAnsi="Calibri"/>
-          <w:color w:val="222222"/>
-          <w:sz w:val="21"/>
-          <w:szCs w:val="21"/>
-        </w:rPr>
-        <w:t xml:space="preserve">Also shipped MakerLog, Regex Forge, GrokSim, and Grok DOOM as supporting / experimental tools.</w:t>
+          <w:spacing w:val="60"/>
+          <w:sz w:val="21"/>
+          <w:szCs w:val="21"/>
+        </w:rPr>
+        <w:t xml:space="preserve">Side projects</w:t>
+      </w:r>
+    </w:p>
+    <w:p>
+      <w:pPr>
+        <w:pStyle w:val="ListParagraph"/>
+        <w:numPr>
+          <w:ilvl w:val="0"/>
+          <w:numId w:val="2"/>
+        </w:numPr>
+        <w:spacing w:after="24" w:line="230"/>
+      </w:pPr>
+      <w:r>
+        <w:rPr>
+          <w:rFonts w:ascii="Calibri" w:cs="Calibri" w:eastAsia="Calibri" w:hAnsi="Calibri"/>
+          <w:color w:val="222222"/>
+          <w:sz w:val="21"/>
+          <w:szCs w:val="21"/>
+        </w:rPr>
+        <w:t xml:space="preserve">Shipped MakerLog, Regex Forge, GrokSim, and Grok DOOM as supporting / experimental tools.</w:t>
       </w:r>
     </w:p>
     <w:p>

</xml_diff>